<commit_message>
chore: persist WIP eval harness, plans, and local tooling changes
Commit outstanding working-tree changes on main: candidate102a evidence
test artifacts, A1 plan doc, embedding platform fallback, RAGChecker
constructor annotation, start.sh install step, and serena project config.
</commit_message>
<xml_diff>
--- a/23030327许子祺/1-第2周报.docx
+++ b/23030327许子祺/1-第2周报.docx
@@ -195,17 +195,7 @@
           <w:sz w:val="30"/>
           <w:u w:val="single"/>
         </w:rPr>
-        <w:t xml:space="preserve">      </w:t>
-      </w:r>
-      <w:bookmarkStart w:id="0" w:name="_GoBack"/>
-      <w:bookmarkEnd w:id="0"/>
-      <w:r>
-        <w:rPr>
-          <w:rFonts w:hint="eastAsia"/>
-          <w:sz w:val="30"/>
-          <w:u w:val="single"/>
-        </w:rPr>
-        <w:t xml:space="preserve">    </w:t>
+        <w:t xml:space="preserve">          </w:t>
       </w:r>
       <w:r>
         <w:rPr>
@@ -969,18 +959,8 @@
                 <w:lang w:eastAsia="zh-CN"/>
               </w:rPr>
             </w:pPr>
-          </w:p>
-          <w:p>
-            <w:pPr>
-              <w:tabs>
-                <w:tab w:val="left" w:pos="1184"/>
-              </w:tabs>
-              <w:jc w:val="left"/>
-              <w:rPr>
-                <w:rFonts w:hint="eastAsia"/>
-                <w:lang w:eastAsia="zh-CN"/>
-              </w:rPr>
-            </w:pPr>
+            <w:bookmarkStart w:id="0" w:name="_GoBack"/>
+            <w:bookmarkEnd w:id="0"/>
           </w:p>
           <w:p>
             <w:pPr>

</xml_diff>